<commit_message>
Reorder curriculum + code-block readability fixes
Curriculum reorder (업무 자동화 is a beginner quick-win, not a capstone):
- C1 하네스 첫걸음 → C2 업무 자동화(초급) → C3 리서치 → C4 크리에이티브
  → C5 미디어 → C6 콘텐츠 → C7 Seedance 영상
- Renamed folders/files/URLs, renumbered course_id, reframed automation to 초급,
  updated all cross-references, nav chain, README, CLAUDE.md, C1 deck + handout

Code-block readability:
- Prompt/code blocks now wrap (white-space:pre-wrap) instead of horizontal scroll
- Removed the white pill background behind code text inside code blocks
</commit_message>
<xml_diff>
--- a/course1-basics/handout/C1_수강생_핸드아웃.docx
+++ b/course1-basics/handout/C1_수강생_핸드아웃.docx
@@ -3978,7 +3978,7 @@
           <w:sz w:val="20"/>
           <w:szCs w:val="20"/>
         </w:rPr>
-        <w:t xml:space="preserve">오늘 배운 기초 위에서, 여러분의 실제 업무로 확장합니다. 다음은 </w:t>
+        <w:t xml:space="preserve">오늘 배운 기초 위에서, 가장 빠른 실전 이득부터 챙깁니다. 다음은 </w:t>
       </w:r>
       <w:r>
         <w:rPr>
@@ -3989,7 +3989,7 @@
           <w:sz w:val="20"/>
           <w:szCs w:val="20"/>
         </w:rPr>
-        <w:t xml:space="preserve">C2 — 리서치·인사이트 하네스</w:t>
+        <w:t xml:space="preserve">C2 — 업무 자동화로 생산성 향상 (초급)</w:t>
       </w:r>
       <w:r>
         <w:rPr>
@@ -3998,7 +3998,7 @@
           <w:sz w:val="20"/>
           <w:szCs w:val="20"/>
         </w:rPr>
-        <w:t xml:space="preserve">입니다. 여러 각도로 동시에 조사하고 교차검증해, 하루 걸리던 카테고리 진단을 한 시간에 끝내는 팀을 만듭니다.</w:t>
+        <w:t xml:space="preserve">입니다. 매주 반복하는 업무 하나를 나만의 하네스로 자동화하고, 결과를 PPT·Word·Excel·PDF로 자동 생성하는 법을 배웁니다.</w:t>
       </w:r>
     </w:p>
     <w:sectPr>

</xml_diff>